<commit_message>
sửa hợp đồng mua bán
</commit_message>
<xml_diff>
--- a/public/templates/HOP_DONG_MUA_BAN.docx
+++ b/public/templates/HOP_DONG_MUA_BAN.docx
@@ -1070,8 +1070,8 @@
     <w:tbl>
       <w:tblPr>
         <w:tblStyle w:val="a"/>
-        <w:tblpPr w:leftFromText="180" w:rightFromText="180" w:vertAnchor="text" w:tblpX="-105" w:tblpY="143"/>
-        <w:tblW w:w="10365" w:type="dxa"/>
+        <w:tblpPr w:leftFromText="180" w:rightFromText="180" w:vertAnchor="text" w:tblpX="-397" w:tblpY="143"/>
+        <w:tblW w:w="10657" w:type="dxa"/>
         <w:tblInd w:w="0" w:type="dxa"/>
         <w:tblBorders>
           <w:top w:val="single" w:sz="4" w:space="0" w:color="000000"/>
@@ -1085,14 +1085,14 @@
         <w:tblLook w:val="0000" w:firstRow="0" w:lastRow="0" w:firstColumn="0" w:lastColumn="0" w:noHBand="0" w:noVBand="0"/>
       </w:tblPr>
       <w:tblGrid>
-        <w:gridCol w:w="570"/>
-        <w:gridCol w:w="2535"/>
-        <w:gridCol w:w="570"/>
-        <w:gridCol w:w="1230"/>
-        <w:gridCol w:w="705"/>
-        <w:gridCol w:w="1155"/>
-        <w:gridCol w:w="960"/>
-        <w:gridCol w:w="1185"/>
+        <w:gridCol w:w="559"/>
+        <w:gridCol w:w="2552"/>
+        <w:gridCol w:w="709"/>
+        <w:gridCol w:w="1275"/>
+        <w:gridCol w:w="709"/>
+        <w:gridCol w:w="1134"/>
+        <w:gridCol w:w="851"/>
+        <w:gridCol w:w="1413"/>
         <w:gridCol w:w="1455"/>
       </w:tblGrid>
       <w:tr>
@@ -1101,7 +1101,7 @@
         </w:trPr>
         <w:tc>
           <w:tcPr>
-            <w:tcW w:w="570" w:type="dxa"/>
+            <w:tcW w:w="559" w:type="dxa"/>
             <w:tcBorders>
               <w:top w:val="single" w:sz="6" w:space="0" w:color="000000"/>
               <w:left w:val="single" w:sz="6" w:space="0" w:color="000000"/>
@@ -1114,7 +1114,7 @@
               <w:bottom w:w="40" w:type="dxa"/>
               <w:right w:w="40" w:type="dxa"/>
             </w:tcMar>
-            <w:vAlign w:val="bottom"/>
+            <w:vAlign w:val="center"/>
           </w:tcPr>
           <w:p>
             <w:pPr>
@@ -1141,7 +1141,7 @@
         </w:tc>
         <w:tc>
           <w:tcPr>
-            <w:tcW w:w="2535" w:type="dxa"/>
+            <w:tcW w:w="2552" w:type="dxa"/>
             <w:tcBorders>
               <w:top w:val="single" w:sz="6" w:space="0" w:color="000000"/>
               <w:left w:val="single" w:sz="6" w:space="0" w:color="CCCCCC"/>
@@ -1154,7 +1154,7 @@
               <w:bottom w:w="40" w:type="dxa"/>
               <w:right w:w="40" w:type="dxa"/>
             </w:tcMar>
-            <w:vAlign w:val="bottom"/>
+            <w:vAlign w:val="center"/>
           </w:tcPr>
           <w:p>
             <w:pPr>
@@ -1181,7 +1181,7 @@
         </w:tc>
         <w:tc>
           <w:tcPr>
-            <w:tcW w:w="570" w:type="dxa"/>
+            <w:tcW w:w="709" w:type="dxa"/>
             <w:tcBorders>
               <w:top w:val="single" w:sz="6" w:space="0" w:color="000000"/>
               <w:left w:val="single" w:sz="6" w:space="0" w:color="CCCCCC"/>
@@ -1194,7 +1194,7 @@
               <w:bottom w:w="40" w:type="dxa"/>
               <w:right w:w="40" w:type="dxa"/>
             </w:tcMar>
-            <w:vAlign w:val="bottom"/>
+            <w:vAlign w:val="center"/>
           </w:tcPr>
           <w:p>
             <w:pPr>
@@ -1221,7 +1221,7 @@
         </w:tc>
         <w:tc>
           <w:tcPr>
-            <w:tcW w:w="1230" w:type="dxa"/>
+            <w:tcW w:w="1275" w:type="dxa"/>
             <w:tcBorders>
               <w:top w:val="single" w:sz="6" w:space="0" w:color="000000"/>
               <w:left w:val="single" w:sz="6" w:space="0" w:color="CCCCCC"/>
@@ -1234,7 +1234,7 @@
               <w:bottom w:w="40" w:type="dxa"/>
               <w:right w:w="40" w:type="dxa"/>
             </w:tcMar>
-            <w:vAlign w:val="bottom"/>
+            <w:vAlign w:val="center"/>
           </w:tcPr>
           <w:p>
             <w:pPr>
@@ -1261,7 +1261,7 @@
         </w:tc>
         <w:tc>
           <w:tcPr>
-            <w:tcW w:w="705" w:type="dxa"/>
+            <w:tcW w:w="709" w:type="dxa"/>
             <w:tcBorders>
               <w:top w:val="single" w:sz="6" w:space="0" w:color="000000"/>
               <w:left w:val="single" w:sz="6" w:space="0" w:color="CCCCCC"/>
@@ -1274,7 +1274,7 @@
               <w:bottom w:w="40" w:type="dxa"/>
               <w:right w:w="40" w:type="dxa"/>
             </w:tcMar>
-            <w:vAlign w:val="bottom"/>
+            <w:vAlign w:val="center"/>
           </w:tcPr>
           <w:p>
             <w:pPr>
@@ -1301,7 +1301,7 @@
         </w:tc>
         <w:tc>
           <w:tcPr>
-            <w:tcW w:w="1155" w:type="dxa"/>
+            <w:tcW w:w="1134" w:type="dxa"/>
             <w:tcBorders>
               <w:top w:val="single" w:sz="6" w:space="0" w:color="000000"/>
               <w:left w:val="single" w:sz="6" w:space="0" w:color="CCCCCC"/>
@@ -1314,7 +1314,7 @@
               <w:bottom w:w="40" w:type="dxa"/>
               <w:right w:w="40" w:type="dxa"/>
             </w:tcMar>
-            <w:vAlign w:val="bottom"/>
+            <w:vAlign w:val="center"/>
           </w:tcPr>
           <w:p>
             <w:pPr>
@@ -1341,7 +1341,7 @@
         </w:tc>
         <w:tc>
           <w:tcPr>
-            <w:tcW w:w="960" w:type="dxa"/>
+            <w:tcW w:w="851" w:type="dxa"/>
             <w:tcBorders>
               <w:top w:val="single" w:sz="6" w:space="0" w:color="000000"/>
               <w:left w:val="single" w:sz="6" w:space="0" w:color="CCCCCC"/>
@@ -1354,7 +1354,7 @@
               <w:bottom w:w="40" w:type="dxa"/>
               <w:right w:w="40" w:type="dxa"/>
             </w:tcMar>
-            <w:vAlign w:val="bottom"/>
+            <w:vAlign w:val="center"/>
           </w:tcPr>
           <w:p>
             <w:pPr>
@@ -1381,7 +1381,7 @@
         </w:tc>
         <w:tc>
           <w:tcPr>
-            <w:tcW w:w="1185" w:type="dxa"/>
+            <w:tcW w:w="1413" w:type="dxa"/>
             <w:tcBorders>
               <w:top w:val="single" w:sz="6" w:space="0" w:color="000000"/>
               <w:left w:val="single" w:sz="6" w:space="0" w:color="CCCCCC"/>
@@ -1394,7 +1394,7 @@
               <w:bottom w:w="40" w:type="dxa"/>
               <w:right w:w="40" w:type="dxa"/>
             </w:tcMar>
-            <w:vAlign w:val="bottom"/>
+            <w:vAlign w:val="center"/>
           </w:tcPr>
           <w:p>
             <w:pPr>
@@ -1434,7 +1434,7 @@
               <w:bottom w:w="40" w:type="dxa"/>
               <w:right w:w="40" w:type="dxa"/>
             </w:tcMar>
-            <w:vAlign w:val="bottom"/>
+            <w:vAlign w:val="center"/>
           </w:tcPr>
           <w:p>
             <w:pPr>
@@ -1466,7 +1466,7 @@
         </w:trPr>
         <w:tc>
           <w:tcPr>
-            <w:tcW w:w="570" w:type="dxa"/>
+            <w:tcW w:w="559" w:type="dxa"/>
             <w:tcBorders>
               <w:top w:val="single" w:sz="4" w:space="0" w:color="auto"/>
               <w:left w:val="single" w:sz="4" w:space="0" w:color="auto"/>
@@ -1509,7 +1509,7 @@
         </w:tc>
         <w:tc>
           <w:tcPr>
-            <w:tcW w:w="2535" w:type="dxa"/>
+            <w:tcW w:w="2552" w:type="dxa"/>
             <w:tcBorders>
               <w:top w:val="single" w:sz="6" w:space="0" w:color="CCCCCC"/>
               <w:left w:val="single" w:sz="4" w:space="0" w:color="auto"/>
@@ -1552,7 +1552,7 @@
         </w:tc>
         <w:tc>
           <w:tcPr>
-            <w:tcW w:w="570" w:type="dxa"/>
+            <w:tcW w:w="709" w:type="dxa"/>
             <w:tcBorders>
               <w:top w:val="single" w:sz="6" w:space="0" w:color="CCCCCC"/>
               <w:left w:val="single" w:sz="6" w:space="0" w:color="CCCCCC"/>
@@ -1582,7 +1582,7 @@
         </w:tc>
         <w:tc>
           <w:tcPr>
-            <w:tcW w:w="1230" w:type="dxa"/>
+            <w:tcW w:w="1275" w:type="dxa"/>
             <w:tcBorders>
               <w:top w:val="single" w:sz="6" w:space="0" w:color="CCCCCC"/>
               <w:left w:val="single" w:sz="6" w:space="0" w:color="CCCCCC"/>
@@ -1612,7 +1612,7 @@
         </w:tc>
         <w:tc>
           <w:tcPr>
-            <w:tcW w:w="705" w:type="dxa"/>
+            <w:tcW w:w="709" w:type="dxa"/>
             <w:tcBorders>
               <w:top w:val="single" w:sz="6" w:space="0" w:color="CCCCCC"/>
               <w:left w:val="single" w:sz="6" w:space="0" w:color="CCCCCC"/>
@@ -1642,7 +1642,7 @@
         </w:tc>
         <w:tc>
           <w:tcPr>
-            <w:tcW w:w="1155" w:type="dxa"/>
+            <w:tcW w:w="1134" w:type="dxa"/>
             <w:tcBorders>
               <w:top w:val="single" w:sz="6" w:space="0" w:color="CCCCCC"/>
               <w:left w:val="single" w:sz="6" w:space="0" w:color="CCCCCC"/>
@@ -1672,7 +1672,7 @@
         </w:tc>
         <w:tc>
           <w:tcPr>
-            <w:tcW w:w="960" w:type="dxa"/>
+            <w:tcW w:w="851" w:type="dxa"/>
             <w:tcBorders>
               <w:top w:val="single" w:sz="6" w:space="0" w:color="CCCCCC"/>
               <w:left w:val="single" w:sz="6" w:space="0" w:color="CCCCCC"/>
@@ -1702,7 +1702,7 @@
         </w:tc>
         <w:tc>
           <w:tcPr>
-            <w:tcW w:w="1185" w:type="dxa"/>
+            <w:tcW w:w="1413" w:type="dxa"/>
             <w:tcBorders>
               <w:top w:val="single" w:sz="6" w:space="0" w:color="CCCCCC"/>
               <w:left w:val="single" w:sz="6" w:space="0" w:color="CCCCCC"/>
@@ -1780,7 +1780,7 @@
         </w:trPr>
         <w:tc>
           <w:tcPr>
-            <w:tcW w:w="570" w:type="dxa"/>
+            <w:tcW w:w="559" w:type="dxa"/>
             <w:tcBorders>
               <w:top w:val="single" w:sz="4" w:space="0" w:color="auto"/>
               <w:left w:val="single" w:sz="4" w:space="0" w:color="auto"/>
@@ -1821,7 +1821,7 @@
         </w:tc>
         <w:tc>
           <w:tcPr>
-            <w:tcW w:w="2535" w:type="dxa"/>
+            <w:tcW w:w="2552" w:type="dxa"/>
             <w:tcBorders>
               <w:top w:val="single" w:sz="4" w:space="0" w:color="auto"/>
               <w:left w:val="single" w:sz="4" w:space="0" w:color="auto"/>
@@ -1859,7 +1859,7 @@
         </w:tc>
         <w:tc>
           <w:tcPr>
-            <w:tcW w:w="570" w:type="dxa"/>
+            <w:tcW w:w="709" w:type="dxa"/>
             <w:tcBorders>
               <w:top w:val="single" w:sz="4" w:space="0" w:color="auto"/>
               <w:left w:val="single" w:sz="4" w:space="0" w:color="auto"/>
@@ -1900,7 +1900,7 @@
         </w:tc>
         <w:tc>
           <w:tcPr>
-            <w:tcW w:w="1230" w:type="dxa"/>
+            <w:tcW w:w="1275" w:type="dxa"/>
             <w:tcBorders>
               <w:top w:val="single" w:sz="4" w:space="0" w:color="auto"/>
               <w:left w:val="single" w:sz="4" w:space="0" w:color="auto"/>
@@ -1936,7 +1936,7 @@
         </w:tc>
         <w:tc>
           <w:tcPr>
-            <w:tcW w:w="705" w:type="dxa"/>
+            <w:tcW w:w="709" w:type="dxa"/>
             <w:tcBorders>
               <w:top w:val="single" w:sz="4" w:space="0" w:color="auto"/>
               <w:left w:val="single" w:sz="4" w:space="0" w:color="auto"/>
@@ -1977,7 +1977,7 @@
         </w:tc>
         <w:tc>
           <w:tcPr>
-            <w:tcW w:w="1155" w:type="dxa"/>
+            <w:tcW w:w="1134" w:type="dxa"/>
             <w:tcBorders>
               <w:top w:val="single" w:sz="4" w:space="0" w:color="auto"/>
               <w:left w:val="single" w:sz="4" w:space="0" w:color="auto"/>
@@ -2018,7 +2018,7 @@
         </w:tc>
         <w:tc>
           <w:tcPr>
-            <w:tcW w:w="960" w:type="dxa"/>
+            <w:tcW w:w="851" w:type="dxa"/>
             <w:tcBorders>
               <w:top w:val="single" w:sz="4" w:space="0" w:color="auto"/>
               <w:left w:val="single" w:sz="4" w:space="0" w:color="auto"/>
@@ -2058,7 +2058,7 @@
         </w:tc>
         <w:tc>
           <w:tcPr>
-            <w:tcW w:w="1185" w:type="dxa"/>
+            <w:tcW w:w="1413" w:type="dxa"/>
             <w:tcBorders>
               <w:top w:val="single" w:sz="4" w:space="0" w:color="auto"/>
               <w:left w:val="single" w:sz="4" w:space="0" w:color="auto"/>
@@ -2153,7 +2153,7 @@
         </w:trPr>
         <w:tc>
           <w:tcPr>
-            <w:tcW w:w="8910" w:type="dxa"/>
+            <w:tcW w:w="9202" w:type="dxa"/>
             <w:gridSpan w:val="8"/>
             <w:tcBorders>
               <w:top w:val="single" w:sz="4" w:space="0" w:color="auto"/>
@@ -2267,7 +2267,7 @@
         </w:trPr>
         <w:tc>
           <w:tcPr>
-            <w:tcW w:w="10365" w:type="dxa"/>
+            <w:tcW w:w="10657" w:type="dxa"/>
             <w:gridSpan w:val="9"/>
             <w:tcBorders>
               <w:top w:val="single" w:sz="6" w:space="0" w:color="CCCCCC"/>
@@ -5025,28 +5025,28 @@
 </file>
 
 <file path=customXml/item1.xml><?xml version="1.0" encoding="utf-8"?>
+<b:Sources xmlns:b="http://schemas.openxmlformats.org/officeDocument/2006/bibliography" xmlns="http://schemas.openxmlformats.org/officeDocument/2006/bibliography" SelectedStyle="\APASixthEditionOfficeOnline.xsl" StyleName="APA" Version="6"/>
+</file>
+
+<file path=customXml/item2.xml><?xml version="1.0" encoding="utf-8"?>
 <go:gDocsCustomXmlDataStorage xmlns:go="http://customooxmlschemas.google.com/" xmlns:r="http://schemas.openxmlformats.org/officeDocument/2006/relationships" uri="GoogleDocsCustomDataVersion2">
   <go:docsCustomData xmlns:go="http://customooxmlschemas.google.com/" roundtripDataSignature="AMtx7mim9l7MRD9C4yVufOkH3eVKAphvFA==">CgMxLjAyCWguMzBqMHpsbDgAciExclNoaHVaTmRpSGY3YnRqWjV4NWF1RFBTblIzWjVkV2k=</go:docsCustomData>
 </go:gDocsCustomXmlDataStorage>
 </file>
 
-<file path=customXml/item2.xml><?xml version="1.0" encoding="utf-8"?>
-<b:Sources xmlns:b="http://schemas.openxmlformats.org/officeDocument/2006/bibliography" xmlns="http://schemas.openxmlformats.org/officeDocument/2006/bibliography" SelectedStyle="\APASixthEditionOfficeOnline.xsl" StyleName="APA" Version="6"/>
+<file path=customXml/itemProps1.xml><?xml version="1.0" encoding="utf-8"?>
+<ds:datastoreItem xmlns:ds="http://schemas.openxmlformats.org/officeDocument/2006/customXml" ds:itemID="{0FA509E7-76D1-426C-97E0-FDCDDED5160A}">
+  <ds:schemaRefs>
+    <ds:schemaRef ds:uri="http://schemas.openxmlformats.org/officeDocument/2006/bibliography"/>
+  </ds:schemaRefs>
+</ds:datastoreItem>
 </file>
 
-<file path=customXml/itemProps1.xml><?xml version="1.0" encoding="utf-8"?>
+<file path=customXml/itemProps2.xml><?xml version="1.0" encoding="utf-8"?>
 <ds:datastoreItem xmlns:ds="http://schemas.openxmlformats.org/officeDocument/2006/customXml" ds:itemID="{11111111-1234-1234-1234-123412341234}">
   <ds:schemaRefs>
     <ds:schemaRef ds:uri="http://customooxmlschemas.google.com/"/>
     <ds:schemaRef ds:uri="http://schemas.openxmlformats.org/officeDocument/2006/relationships"/>
   </ds:schemaRefs>
 </ds:datastoreItem>
-</file>
-
-<file path=customXml/itemProps2.xml><?xml version="1.0" encoding="utf-8"?>
-<ds:datastoreItem xmlns:ds="http://schemas.openxmlformats.org/officeDocument/2006/customXml" ds:itemID="{0FA509E7-76D1-426C-97E0-FDCDDED5160A}">
-  <ds:schemaRefs>
-    <ds:schemaRef ds:uri="http://schemas.openxmlformats.org/officeDocument/2006/bibliography"/>
-  </ds:schemaRefs>
-</ds:datastoreItem>
 </file>
</xml_diff>

<commit_message>
sửa view hợp đồng, mẫu hđ mua bán, view in nhanh
</commit_message>
<xml_diff>
--- a/public/templates/HOP_DONG_MUA_BAN.docx
+++ b/public/templates/HOP_DONG_MUA_BAN.docx
@@ -1145,7 +1145,7 @@
             <w:tcBorders>
               <w:top w:val="single" w:sz="6" w:space="0" w:color="000000"/>
               <w:left w:val="single" w:sz="6" w:space="0" w:color="CCCCCC"/>
-              <w:bottom w:val="single" w:sz="6" w:space="0" w:color="000000"/>
+              <w:bottom w:val="single" w:sz="4" w:space="0" w:color="auto"/>
               <w:right w:val="single" w:sz="6" w:space="0" w:color="000000"/>
             </w:tcBorders>
             <w:tcMar>
@@ -1185,7 +1185,7 @@
             <w:tcBorders>
               <w:top w:val="single" w:sz="6" w:space="0" w:color="000000"/>
               <w:left w:val="single" w:sz="6" w:space="0" w:color="CCCCCC"/>
-              <w:bottom w:val="single" w:sz="6" w:space="0" w:color="000000"/>
+              <w:bottom w:val="single" w:sz="4" w:space="0" w:color="auto"/>
               <w:right w:val="single" w:sz="6" w:space="0" w:color="000000"/>
             </w:tcBorders>
             <w:tcMar>
@@ -1225,7 +1225,7 @@
             <w:tcBorders>
               <w:top w:val="single" w:sz="6" w:space="0" w:color="000000"/>
               <w:left w:val="single" w:sz="6" w:space="0" w:color="CCCCCC"/>
-              <w:bottom w:val="single" w:sz="6" w:space="0" w:color="000000"/>
+              <w:bottom w:val="single" w:sz="4" w:space="0" w:color="auto"/>
               <w:right w:val="single" w:sz="6" w:space="0" w:color="000000"/>
             </w:tcBorders>
             <w:tcMar>
@@ -1265,7 +1265,7 @@
             <w:tcBorders>
               <w:top w:val="single" w:sz="6" w:space="0" w:color="000000"/>
               <w:left w:val="single" w:sz="6" w:space="0" w:color="CCCCCC"/>
-              <w:bottom w:val="single" w:sz="6" w:space="0" w:color="000000"/>
+              <w:bottom w:val="single" w:sz="4" w:space="0" w:color="auto"/>
               <w:right w:val="single" w:sz="6" w:space="0" w:color="000000"/>
             </w:tcBorders>
             <w:tcMar>
@@ -1305,7 +1305,7 @@
             <w:tcBorders>
               <w:top w:val="single" w:sz="6" w:space="0" w:color="000000"/>
               <w:left w:val="single" w:sz="6" w:space="0" w:color="CCCCCC"/>
-              <w:bottom w:val="single" w:sz="6" w:space="0" w:color="000000"/>
+              <w:bottom w:val="single" w:sz="4" w:space="0" w:color="auto"/>
               <w:right w:val="single" w:sz="6" w:space="0" w:color="000000"/>
             </w:tcBorders>
             <w:tcMar>
@@ -1345,7 +1345,7 @@
             <w:tcBorders>
               <w:top w:val="single" w:sz="6" w:space="0" w:color="000000"/>
               <w:left w:val="single" w:sz="6" w:space="0" w:color="CCCCCC"/>
-              <w:bottom w:val="single" w:sz="6" w:space="0" w:color="000000"/>
+              <w:bottom w:val="single" w:sz="4" w:space="0" w:color="auto"/>
               <w:right w:val="single" w:sz="6" w:space="0" w:color="000000"/>
             </w:tcBorders>
             <w:tcMar>
@@ -1385,7 +1385,7 @@
             <w:tcBorders>
               <w:top w:val="single" w:sz="6" w:space="0" w:color="000000"/>
               <w:left w:val="single" w:sz="6" w:space="0" w:color="CCCCCC"/>
-              <w:bottom w:val="single" w:sz="6" w:space="0" w:color="000000"/>
+              <w:bottom w:val="single" w:sz="4" w:space="0" w:color="auto"/>
               <w:right w:val="single" w:sz="6" w:space="0" w:color="000000"/>
             </w:tcBorders>
             <w:tcMar>
@@ -1425,7 +1425,7 @@
             <w:tcBorders>
               <w:top w:val="single" w:sz="6" w:space="0" w:color="000000"/>
               <w:left w:val="single" w:sz="6" w:space="0" w:color="CCCCCC"/>
-              <w:bottom w:val="single" w:sz="6" w:space="0" w:color="000000"/>
+              <w:bottom w:val="single" w:sz="4" w:space="0" w:color="auto"/>
               <w:right w:val="single" w:sz="6" w:space="0" w:color="000000"/>
             </w:tcBorders>
             <w:tcMar>
@@ -1511,10 +1511,10 @@
           <w:tcPr>
             <w:tcW w:w="2552" w:type="dxa"/>
             <w:tcBorders>
-              <w:top w:val="single" w:sz="6" w:space="0" w:color="CCCCCC"/>
+              <w:top w:val="single" w:sz="4" w:space="0" w:color="auto"/>
               <w:left w:val="single" w:sz="4" w:space="0" w:color="auto"/>
               <w:bottom w:val="single" w:sz="4" w:space="0" w:color="auto"/>
-              <w:right w:val="single" w:sz="6" w:space="0" w:color="000000"/>
+              <w:right w:val="single" w:sz="4" w:space="0" w:color="auto"/>
             </w:tcBorders>
             <w:shd w:val="clear" w:color="auto" w:fill="00CCFF"/>
             <w:tcMar>
@@ -1554,10 +1554,10 @@
           <w:tcPr>
             <w:tcW w:w="709" w:type="dxa"/>
             <w:tcBorders>
-              <w:top w:val="single" w:sz="6" w:space="0" w:color="CCCCCC"/>
-              <w:left w:val="single" w:sz="6" w:space="0" w:color="CCCCCC"/>
+              <w:top w:val="single" w:sz="4" w:space="0" w:color="auto"/>
+              <w:left w:val="single" w:sz="4" w:space="0" w:color="auto"/>
               <w:bottom w:val="single" w:sz="4" w:space="0" w:color="auto"/>
-              <w:right w:val="single" w:sz="6" w:space="0" w:color="000000"/>
+              <w:right w:val="single" w:sz="4" w:space="0" w:color="auto"/>
             </w:tcBorders>
             <w:shd w:val="clear" w:color="auto" w:fill="00CCFF"/>
             <w:tcMar>
@@ -1584,10 +1584,10 @@
           <w:tcPr>
             <w:tcW w:w="1275" w:type="dxa"/>
             <w:tcBorders>
-              <w:top w:val="single" w:sz="6" w:space="0" w:color="CCCCCC"/>
-              <w:left w:val="single" w:sz="6" w:space="0" w:color="CCCCCC"/>
+              <w:top w:val="single" w:sz="4" w:space="0" w:color="auto"/>
+              <w:left w:val="single" w:sz="4" w:space="0" w:color="auto"/>
               <w:bottom w:val="single" w:sz="4" w:space="0" w:color="auto"/>
-              <w:right w:val="single" w:sz="6" w:space="0" w:color="000000"/>
+              <w:right w:val="single" w:sz="4" w:space="0" w:color="auto"/>
             </w:tcBorders>
             <w:shd w:val="clear" w:color="auto" w:fill="00CCFF"/>
             <w:tcMar>
@@ -1614,10 +1614,10 @@
           <w:tcPr>
             <w:tcW w:w="709" w:type="dxa"/>
             <w:tcBorders>
-              <w:top w:val="single" w:sz="6" w:space="0" w:color="CCCCCC"/>
-              <w:left w:val="single" w:sz="6" w:space="0" w:color="CCCCCC"/>
+              <w:top w:val="single" w:sz="4" w:space="0" w:color="auto"/>
+              <w:left w:val="single" w:sz="4" w:space="0" w:color="auto"/>
               <w:bottom w:val="single" w:sz="4" w:space="0" w:color="auto"/>
-              <w:right w:val="single" w:sz="6" w:space="0" w:color="000000"/>
+              <w:right w:val="single" w:sz="4" w:space="0" w:color="auto"/>
             </w:tcBorders>
             <w:shd w:val="clear" w:color="auto" w:fill="00CCFF"/>
             <w:tcMar>
@@ -1644,10 +1644,10 @@
           <w:tcPr>
             <w:tcW w:w="1134" w:type="dxa"/>
             <w:tcBorders>
-              <w:top w:val="single" w:sz="6" w:space="0" w:color="CCCCCC"/>
-              <w:left w:val="single" w:sz="6" w:space="0" w:color="CCCCCC"/>
+              <w:top w:val="single" w:sz="4" w:space="0" w:color="auto"/>
+              <w:left w:val="single" w:sz="4" w:space="0" w:color="auto"/>
               <w:bottom w:val="single" w:sz="4" w:space="0" w:color="auto"/>
-              <w:right w:val="single" w:sz="6" w:space="0" w:color="000000"/>
+              <w:right w:val="single" w:sz="4" w:space="0" w:color="auto"/>
             </w:tcBorders>
             <w:shd w:val="clear" w:color="auto" w:fill="00CCFF"/>
             <w:tcMar>
@@ -1674,10 +1674,10 @@
           <w:tcPr>
             <w:tcW w:w="851" w:type="dxa"/>
             <w:tcBorders>
-              <w:top w:val="single" w:sz="6" w:space="0" w:color="CCCCCC"/>
-              <w:left w:val="single" w:sz="6" w:space="0" w:color="CCCCCC"/>
+              <w:top w:val="single" w:sz="4" w:space="0" w:color="auto"/>
+              <w:left w:val="single" w:sz="4" w:space="0" w:color="auto"/>
               <w:bottom w:val="single" w:sz="4" w:space="0" w:color="auto"/>
-              <w:right w:val="single" w:sz="6" w:space="0" w:color="000000"/>
+              <w:right w:val="single" w:sz="4" w:space="0" w:color="auto"/>
             </w:tcBorders>
             <w:shd w:val="clear" w:color="auto" w:fill="00CCFF"/>
             <w:tcMar>
@@ -1704,10 +1704,10 @@
           <w:tcPr>
             <w:tcW w:w="1413" w:type="dxa"/>
             <w:tcBorders>
-              <w:top w:val="single" w:sz="6" w:space="0" w:color="CCCCCC"/>
-              <w:left w:val="single" w:sz="6" w:space="0" w:color="CCCCCC"/>
+              <w:top w:val="single" w:sz="4" w:space="0" w:color="auto"/>
+              <w:left w:val="single" w:sz="4" w:space="0" w:color="auto"/>
               <w:bottom w:val="single" w:sz="4" w:space="0" w:color="auto"/>
-              <w:right w:val="single" w:sz="6" w:space="0" w:color="000000"/>
+              <w:right w:val="single" w:sz="4" w:space="0" w:color="auto"/>
             </w:tcBorders>
             <w:shd w:val="clear" w:color="auto" w:fill="00CCFF"/>
             <w:tcMar>
@@ -1734,10 +1734,10 @@
           <w:tcPr>
             <w:tcW w:w="1455" w:type="dxa"/>
             <w:tcBorders>
-              <w:top w:val="single" w:sz="6" w:space="0" w:color="CCCCCC"/>
-              <w:left w:val="single" w:sz="6" w:space="0" w:color="CCCCCC"/>
+              <w:top w:val="single" w:sz="4" w:space="0" w:color="auto"/>
+              <w:left w:val="single" w:sz="4" w:space="0" w:color="auto"/>
               <w:bottom w:val="single" w:sz="4" w:space="0" w:color="auto"/>
-              <w:right w:val="single" w:sz="6" w:space="0" w:color="000000"/>
+              <w:right w:val="single" w:sz="4" w:space="0" w:color="auto"/>
             </w:tcBorders>
             <w:shd w:val="clear" w:color="auto" w:fill="00CCFF"/>
             <w:tcMar>
@@ -2157,9 +2157,9 @@
             <w:gridSpan w:val="8"/>
             <w:tcBorders>
               <w:top w:val="single" w:sz="4" w:space="0" w:color="auto"/>
-              <w:left w:val="single" w:sz="6" w:space="0" w:color="000000"/>
-              <w:bottom w:val="single" w:sz="6" w:space="0" w:color="000000"/>
-              <w:right w:val="single" w:sz="6" w:space="0" w:color="000000"/>
+              <w:left w:val="single" w:sz="4" w:space="0" w:color="auto"/>
+              <w:bottom w:val="single" w:sz="4" w:space="0" w:color="auto"/>
+              <w:right w:val="single" w:sz="4" w:space="0" w:color="auto"/>
             </w:tcBorders>
             <w:tcMar>
               <w:top w:w="40" w:type="dxa"/>
@@ -2198,9 +2198,9 @@
             <w:tcW w:w="1455" w:type="dxa"/>
             <w:tcBorders>
               <w:top w:val="single" w:sz="4" w:space="0" w:color="auto"/>
-              <w:left w:val="single" w:sz="6" w:space="0" w:color="CCCCCC"/>
-              <w:bottom w:val="single" w:sz="6" w:space="0" w:color="000000"/>
-              <w:right w:val="single" w:sz="6" w:space="0" w:color="000000"/>
+              <w:left w:val="single" w:sz="4" w:space="0" w:color="auto"/>
+              <w:bottom w:val="single" w:sz="4" w:space="0" w:color="auto"/>
+              <w:right w:val="single" w:sz="4" w:space="0" w:color="auto"/>
             </w:tcBorders>
             <w:tcMar>
               <w:top w:w="40" w:type="dxa"/>
@@ -2270,10 +2270,10 @@
             <w:tcW w:w="10657" w:type="dxa"/>
             <w:gridSpan w:val="9"/>
             <w:tcBorders>
-              <w:top w:val="single" w:sz="6" w:space="0" w:color="CCCCCC"/>
-              <w:left w:val="single" w:sz="6" w:space="0" w:color="000000"/>
-              <w:bottom w:val="single" w:sz="6" w:space="0" w:color="000000"/>
-              <w:right w:val="single" w:sz="6" w:space="0" w:color="000000"/>
+              <w:top w:val="single" w:sz="4" w:space="0" w:color="auto"/>
+              <w:left w:val="single" w:sz="4" w:space="0" w:color="auto"/>
+              <w:bottom w:val="single" w:sz="4" w:space="0" w:color="auto"/>
+              <w:right w:val="single" w:sz="4" w:space="0" w:color="auto"/>
             </w:tcBorders>
             <w:tcMar>
               <w:top w:w="40" w:type="dxa"/>
@@ -5025,28 +5025,28 @@
 </file>
 
 <file path=customXml/item1.xml><?xml version="1.0" encoding="utf-8"?>
-<b:Sources xmlns:b="http://schemas.openxmlformats.org/officeDocument/2006/bibliography" xmlns="http://schemas.openxmlformats.org/officeDocument/2006/bibliography" SelectedStyle="\APASixthEditionOfficeOnline.xsl" StyleName="APA" Version="6"/>
-</file>
-
-<file path=customXml/item2.xml><?xml version="1.0" encoding="utf-8"?>
 <go:gDocsCustomXmlDataStorage xmlns:go="http://customooxmlschemas.google.com/" xmlns:r="http://schemas.openxmlformats.org/officeDocument/2006/relationships" uri="GoogleDocsCustomDataVersion2">
   <go:docsCustomData xmlns:go="http://customooxmlschemas.google.com/" roundtripDataSignature="AMtx7mim9l7MRD9C4yVufOkH3eVKAphvFA==">CgMxLjAyCWguMzBqMHpsbDgAciExclNoaHVaTmRpSGY3YnRqWjV4NWF1RFBTblIzWjVkV2k=</go:docsCustomData>
 </go:gDocsCustomXmlDataStorage>
 </file>
 
-<file path=customXml/itemProps1.xml><?xml version="1.0" encoding="utf-8"?>
-<ds:datastoreItem xmlns:ds="http://schemas.openxmlformats.org/officeDocument/2006/customXml" ds:itemID="{0FA509E7-76D1-426C-97E0-FDCDDED5160A}">
-  <ds:schemaRefs>
-    <ds:schemaRef ds:uri="http://schemas.openxmlformats.org/officeDocument/2006/bibliography"/>
-  </ds:schemaRefs>
-</ds:datastoreItem>
+<file path=customXml/item2.xml><?xml version="1.0" encoding="utf-8"?>
+<b:Sources xmlns:b="http://schemas.openxmlformats.org/officeDocument/2006/bibliography" xmlns="http://schemas.openxmlformats.org/officeDocument/2006/bibliography" SelectedStyle="\APASixthEditionOfficeOnline.xsl" StyleName="APA" Version="6"/>
 </file>
 
-<file path=customXml/itemProps2.xml><?xml version="1.0" encoding="utf-8"?>
+<file path=customXml/itemProps1.xml><?xml version="1.0" encoding="utf-8"?>
 <ds:datastoreItem xmlns:ds="http://schemas.openxmlformats.org/officeDocument/2006/customXml" ds:itemID="{11111111-1234-1234-1234-123412341234}">
   <ds:schemaRefs>
     <ds:schemaRef ds:uri="http://customooxmlschemas.google.com/"/>
     <ds:schemaRef ds:uri="http://schemas.openxmlformats.org/officeDocument/2006/relationships"/>
   </ds:schemaRefs>
 </ds:datastoreItem>
+</file>
+
+<file path=customXml/itemProps2.xml><?xml version="1.0" encoding="utf-8"?>
+<ds:datastoreItem xmlns:ds="http://schemas.openxmlformats.org/officeDocument/2006/customXml" ds:itemID="{0FA509E7-76D1-426C-97E0-FDCDDED5160A}">
+  <ds:schemaRefs>
+    <ds:schemaRef ds:uri="http://schemas.openxmlformats.org/officeDocument/2006/bibliography"/>
+  </ds:schemaRefs>
+</ds:datastoreItem>
 </file>
</xml_diff>